<commit_message>
docs: regenerate the Word files of every updated document
</commit_message>
<xml_diff>
--- a/05_ARTEFACTOS_DE_CODIGO/EN/WORD/05_Code_Artifacts.docx
+++ b/05_ARTEFACTOS_DE_CODIGO/EN/WORD/05_Code_Artifacts.docx
@@ -268,7 +268,7 @@
               <w:pStyle w:val="Compact"/>
             </w:pPr>
             <w:r>
-              <w:t xml:space="preserve">October 15, 2026</w:t>
+              <w:t xml:space="preserve">October 16, 2026</w:t>
             </w:r>
           </w:p>
         </w:tc>
@@ -446,29 +446,29 @@
               <w:pStyle w:val="Compact"/>
             </w:pPr>
             <w:r>
-              <w:t xml:space="preserve">Angular 21.2.7, TypeScript 5.9</w:t>
-            </w:r>
-          </w:p>
-        </w:tc>
-        <w:tc>
-          <w:tcPr/>
-          <w:p>
-            <w:pPr>
-              <w:pStyle w:val="Compact"/>
-            </w:pPr>
-            <w:r>
-              <w:t xml:space="preserve">324</w:t>
-            </w:r>
-          </w:p>
-        </w:tc>
-        <w:tc>
-          <w:tcPr/>
-          <w:p>
-            <w:pPr>
-              <w:pStyle w:val="Compact"/>
-            </w:pPr>
-            <w:r>
-              <w:t xml:space="preserve">2026-10-15</w:t>
+              <w:t xml:space="preserve">Angular 21.2.25, TypeScript 5.9</w:t>
+            </w:r>
+          </w:p>
+        </w:tc>
+        <w:tc>
+          <w:tcPr/>
+          <w:p>
+            <w:pPr>
+              <w:pStyle w:val="Compact"/>
+            </w:pPr>
+            <w:r>
+              <w:t xml:space="preserve">395</w:t>
+            </w:r>
+          </w:p>
+        </w:tc>
+        <w:tc>
+          <w:tcPr/>
+          <w:p>
+            <w:pPr>
+              <w:pStyle w:val="Compact"/>
+            </w:pPr>
+            <w:r>
+              <w:t xml:space="preserve">2026-10-16</w:t>
             </w:r>
           </w:p>
         </w:tc>
@@ -519,18 +519,18 @@
               <w:pStyle w:val="Compact"/>
             </w:pPr>
             <w:r>
-              <w:t xml:space="preserve">125</w:t>
-            </w:r>
-          </w:p>
-        </w:tc>
-        <w:tc>
-          <w:tcPr/>
-          <w:p>
-            <w:pPr>
-              <w:pStyle w:val="Compact"/>
-            </w:pPr>
-            <w:r>
-              <w:t xml:space="preserve">2026-10-15</w:t>
+              <w:t xml:space="preserve">173</w:t>
+            </w:r>
+          </w:p>
+        </w:tc>
+        <w:tc>
+          <w:tcPr/>
+          <w:p>
+            <w:pPr>
+              <w:pStyle w:val="Compact"/>
+            </w:pPr>
+            <w:r>
+              <w:t xml:space="preserve">2026-10-16</w:t>
             </w:r>
           </w:p>
         </w:tc>
@@ -581,18 +581,18 @@
               <w:pStyle w:val="Compact"/>
             </w:pPr>
             <w:r>
-              <w:t xml:space="preserve">27</w:t>
-            </w:r>
-          </w:p>
-        </w:tc>
-        <w:tc>
-          <w:tcPr/>
-          <w:p>
-            <w:pPr>
-              <w:pStyle w:val="Compact"/>
-            </w:pPr>
-            <w:r>
-              <w:t xml:space="preserve">2026-10-14</w:t>
+              <w:t xml:space="preserve">57</w:t>
+            </w:r>
+          </w:p>
+        </w:tc>
+        <w:tc>
+          <w:tcPr/>
+          <w:p>
+            <w:pPr>
+              <w:pStyle w:val="Compact"/>
+            </w:pPr>
+            <w:r>
+              <w:t xml:space="preserve">2026-10-16</w:t>
             </w:r>
           </w:p>
         </w:tc>
@@ -705,18 +705,18 @@
               <w:pStyle w:val="Compact"/>
             </w:pPr>
             <w:r>
-              <w:t xml:space="preserve">38</w:t>
-            </w:r>
-          </w:p>
-        </w:tc>
-        <w:tc>
-          <w:tcPr/>
-          <w:p>
-            <w:pPr>
-              <w:pStyle w:val="Compact"/>
-            </w:pPr>
-            <w:r>
-              <w:t xml:space="preserve">2026-10-15</w:t>
+              <w:t xml:space="preserve">48</w:t>
+            </w:r>
+          </w:p>
+        </w:tc>
+        <w:tc>
+          <w:tcPr/>
+          <w:p>
+            <w:pPr>
+              <w:pStyle w:val="Compact"/>
+            </w:pPr>
+            <w:r>
+              <w:t xml:space="preserve">2026-10-16</w:t>
             </w:r>
           </w:p>
         </w:tc>
@@ -767,18 +767,18 @@
               <w:pStyle w:val="Compact"/>
             </w:pPr>
             <w:r>
-              <w:t xml:space="preserve">14</w:t>
-            </w:r>
-          </w:p>
-        </w:tc>
-        <w:tc>
-          <w:tcPr/>
-          <w:p>
-            <w:pPr>
-              <w:pStyle w:val="Compact"/>
-            </w:pPr>
-            <w:r>
-              <w:t xml:space="preserve">2026-10-05</w:t>
+              <w:t xml:space="preserve">16</w:t>
+            </w:r>
+          </w:p>
+        </w:tc>
+        <w:tc>
+          <w:tcPr/>
+          <w:p>
+            <w:pPr>
+              <w:pStyle w:val="Compact"/>
+            </w:pPr>
+            <w:r>
+              <w:t xml:space="preserve">2026-10-16</w:t>
             </w:r>
           </w:p>
         </w:tc>
@@ -829,18 +829,18 @@
               <w:pStyle w:val="Compact"/>
             </w:pPr>
             <w:r>
-              <w:t xml:space="preserve">40</w:t>
-            </w:r>
-          </w:p>
-        </w:tc>
-        <w:tc>
-          <w:tcPr/>
-          <w:p>
-            <w:pPr>
-              <w:pStyle w:val="Compact"/>
-            </w:pPr>
-            <w:r>
-              <w:t xml:space="preserve">2026-10-15</w:t>
+              <w:t xml:space="preserve">44</w:t>
+            </w:r>
+          </w:p>
+        </w:tc>
+        <w:tc>
+          <w:tcPr/>
+          <w:p>
+            <w:pPr>
+              <w:pStyle w:val="Compact"/>
+            </w:pPr>
+            <w:r>
+              <w:t xml:space="preserve">2026-10-16</w:t>
             </w:r>
           </w:p>
         </w:tc>
@@ -891,18 +891,18 @@
               <w:pStyle w:val="Compact"/>
             </w:pPr>
             <w:r>
-              <w:t xml:space="preserve">25</w:t>
-            </w:r>
-          </w:p>
-        </w:tc>
-        <w:tc>
-          <w:tcPr/>
-          <w:p>
-            <w:pPr>
-              <w:pStyle w:val="Compact"/>
-            </w:pPr>
-            <w:r>
-              <w:t xml:space="preserve">2026-10-15</w:t>
+              <w:t xml:space="preserve">34</w:t>
+            </w:r>
+          </w:p>
+        </w:tc>
+        <w:tc>
+          <w:tcPr/>
+          <w:p>
+            <w:pPr>
+              <w:pStyle w:val="Compact"/>
+            </w:pPr>
+            <w:r>
+              <w:t xml:space="preserve">2026-10-16</w:t>
             </w:r>
           </w:p>
         </w:tc>
@@ -953,18 +953,18 @@
               <w:pStyle w:val="Compact"/>
             </w:pPr>
             <w:r>
-              <w:t xml:space="preserve">33</w:t>
-            </w:r>
-          </w:p>
-        </w:tc>
-        <w:tc>
-          <w:tcPr/>
-          <w:p>
-            <w:pPr>
-              <w:pStyle w:val="Compact"/>
-            </w:pPr>
-            <w:r>
-              <w:t xml:space="preserve">2026-10-14</w:t>
+              <w:t xml:space="preserve">38</w:t>
+            </w:r>
+          </w:p>
+        </w:tc>
+        <w:tc>
+          <w:tcPr/>
+          <w:p>
+            <w:pPr>
+              <w:pStyle w:val="Compact"/>
+            </w:pPr>
+            <w:r>
+              <w:t xml:space="preserve">2026-10-16</w:t>
             </w:r>
           </w:p>
         </w:tc>
@@ -1015,18 +1015,18 @@
               <w:pStyle w:val="Compact"/>
             </w:pPr>
             <w:r>
-              <w:t xml:space="preserve">24</w:t>
-            </w:r>
-          </w:p>
-        </w:tc>
-        <w:tc>
-          <w:tcPr/>
-          <w:p>
-            <w:pPr>
-              <w:pStyle w:val="Compact"/>
-            </w:pPr>
-            <w:r>
-              <w:t xml:space="preserve">2026-10-14</w:t>
+              <w:t xml:space="preserve">33</w:t>
+            </w:r>
+          </w:p>
+        </w:tc>
+        <w:tc>
+          <w:tcPr/>
+          <w:p>
+            <w:pPr>
+              <w:pStyle w:val="Compact"/>
+            </w:pPr>
+            <w:r>
+              <w:t xml:space="preserve">2026-10-16</w:t>
             </w:r>
           </w:p>
         </w:tc>
@@ -2316,7 +2316,7 @@
               <w:pStyle w:val="Compact"/>
             </w:pPr>
             <w:r>
-              <w:t xml:space="preserve">21.2.7</w:t>
+              <w:t xml:space="preserve">21.2.25 (Material and CDK 21.2.14)</w:t>
             </w:r>
           </w:p>
         </w:tc>
@@ -2504,7 +2504,7 @@
               <w:pStyle w:val="Compact"/>
             </w:pPr>
             <w:r>
-              <w:t xml:space="preserve">^0.18.5, ^2.0.5</w:t>
+              <w:t xml:space="preserve">0.20.3 (SheetJS CDN), ^2.0.5</w:t>
             </w:r>
           </w:p>
         </w:tc>
@@ -2855,7 +2855,7 @@
         <w:pStyle w:val="BodyText"/>
       </w:pPr>
       <w:r>
-        <w:t xml:space="preserve">According to SRS v6 (RNF-008), the web client must work on current versions of Chrome, Firefox, and Edge and be usable from 360 px wide.</w:t>
+        <w:t xml:space="preserve">According to SRS v7 (RNF-008), the web client must work on current versions of Chrome, Firefox, and Edge and be usable from 360 px wide.</w:t>
       </w:r>
     </w:p>
     <w:bookmarkEnd w:id="34"/>
@@ -6331,7 +6331,7 @@
       <w:color w:themeColor="accent1" w:themeShade="BF" w:val="365F91"/>
     </w:rPr>
   </w:style>
-  <w:style w:type="paragraph" w:customStyle="1" w:styleId="SourceCode">
+  <w:style w:customStyle="1" w:styleId="SourceCode" w:type="paragraph">
     <w:name w:val="Source Code"/>
     <w:basedOn w:val="Normal"/>
     <w:link w:val="VerbatimChar"/>
@@ -6339,7 +6339,7 @@
       <w:wordWrap w:val="off"/>
     </w:pPr>
   </w:style>
-  <w:style w:type="character" w:customStyle="1" w:styleId="KeywordTok">
+  <w:style w:customStyle="1" w:styleId="KeywordTok" w:type="character">
     <w:name w:val="KeywordTok"/>
     <w:basedOn w:val="VerbatimChar"/>
     <w:rPr>
@@ -6347,77 +6347,77 @@
       <w:color w:val="007020"/>
     </w:rPr>
   </w:style>
-  <w:style w:type="character" w:customStyle="1" w:styleId="DataTypeTok">
+  <w:style w:customStyle="1" w:styleId="DataTypeTok" w:type="character">
     <w:name w:val="DataTypeTok"/>
     <w:basedOn w:val="VerbatimChar"/>
     <w:rPr>
       <w:color w:val="902000"/>
     </w:rPr>
   </w:style>
-  <w:style w:type="character" w:customStyle="1" w:styleId="DecValTok">
+  <w:style w:customStyle="1" w:styleId="DecValTok" w:type="character">
     <w:name w:val="DecValTok"/>
     <w:basedOn w:val="VerbatimChar"/>
     <w:rPr>
       <w:color w:val="40a070"/>
     </w:rPr>
   </w:style>
-  <w:style w:type="character" w:customStyle="1" w:styleId="BaseNTok">
+  <w:style w:customStyle="1" w:styleId="BaseNTok" w:type="character">
     <w:name w:val="BaseNTok"/>
     <w:basedOn w:val="VerbatimChar"/>
     <w:rPr>
       <w:color w:val="40a070"/>
     </w:rPr>
   </w:style>
-  <w:style w:type="character" w:customStyle="1" w:styleId="FloatTok">
+  <w:style w:customStyle="1" w:styleId="FloatTok" w:type="character">
     <w:name w:val="FloatTok"/>
     <w:basedOn w:val="VerbatimChar"/>
     <w:rPr>
       <w:color w:val="40a070"/>
     </w:rPr>
   </w:style>
-  <w:style w:type="character" w:customStyle="1" w:styleId="ConstantTok">
+  <w:style w:customStyle="1" w:styleId="ConstantTok" w:type="character">
     <w:name w:val="ConstantTok"/>
     <w:basedOn w:val="VerbatimChar"/>
     <w:rPr>
       <w:color w:val="880000"/>
     </w:rPr>
   </w:style>
-  <w:style w:type="character" w:customStyle="1" w:styleId="CharTok">
+  <w:style w:customStyle="1" w:styleId="CharTok" w:type="character">
     <w:name w:val="CharTok"/>
     <w:basedOn w:val="VerbatimChar"/>
     <w:rPr>
       <w:color w:val="4070a0"/>
     </w:rPr>
   </w:style>
-  <w:style w:type="character" w:customStyle="1" w:styleId="SpecialCharTok">
+  <w:style w:customStyle="1" w:styleId="SpecialCharTok" w:type="character">
     <w:name w:val="SpecialCharTok"/>
     <w:basedOn w:val="VerbatimChar"/>
     <w:rPr>
       <w:color w:val="4070a0"/>
     </w:rPr>
   </w:style>
-  <w:style w:type="character" w:customStyle="1" w:styleId="StringTok">
+  <w:style w:customStyle="1" w:styleId="StringTok" w:type="character">
     <w:name w:val="StringTok"/>
     <w:basedOn w:val="VerbatimChar"/>
     <w:rPr>
       <w:color w:val="4070a0"/>
     </w:rPr>
   </w:style>
-  <w:style w:type="character" w:customStyle="1" w:styleId="VerbatimStringTok">
+  <w:style w:customStyle="1" w:styleId="VerbatimStringTok" w:type="character">
     <w:name w:val="VerbatimStringTok"/>
     <w:basedOn w:val="VerbatimChar"/>
     <w:rPr>
       <w:color w:val="4070a0"/>
     </w:rPr>
   </w:style>
-  <w:style w:type="character" w:customStyle="1" w:styleId="SpecialStringTok">
+  <w:style w:customStyle="1" w:styleId="SpecialStringTok" w:type="character">
     <w:name w:val="SpecialStringTok"/>
     <w:basedOn w:val="VerbatimChar"/>
     <w:rPr>
       <w:color w:val="bb6688"/>
     </w:rPr>
   </w:style>
-  <w:style w:type="character" w:customStyle="1" w:styleId="ImportTok">
+  <w:style w:customStyle="1" w:styleId="ImportTok" w:type="character">
     <w:name w:val="ImportTok"/>
     <w:basedOn w:val="VerbatimChar"/>
     <w:rPr>
@@ -6425,7 +6425,7 @@
       <w:color w:val="008000"/>
     </w:rPr>
   </w:style>
-  <w:style w:type="character" w:customStyle="1" w:styleId="CommentTok">
+  <w:style w:customStyle="1" w:styleId="CommentTok" w:type="character">
     <w:name w:val="CommentTok"/>
     <w:basedOn w:val="VerbatimChar"/>
     <w:rPr>
@@ -6433,7 +6433,7 @@
       <w:color w:val="60a0b0"/>
     </w:rPr>
   </w:style>
-  <w:style w:type="character" w:customStyle="1" w:styleId="DocumentationTok">
+  <w:style w:customStyle="1" w:styleId="DocumentationTok" w:type="character">
     <w:name w:val="DocumentationTok"/>
     <w:basedOn w:val="VerbatimChar"/>
     <w:rPr>
@@ -6441,7 +6441,7 @@
       <w:color w:val="ba2121"/>
     </w:rPr>
   </w:style>
-  <w:style w:type="character" w:customStyle="1" w:styleId="AnnotationTok">
+  <w:style w:customStyle="1" w:styleId="AnnotationTok" w:type="character">
     <w:name w:val="AnnotationTok"/>
     <w:basedOn w:val="VerbatimChar"/>
     <w:rPr>
@@ -6450,7 +6450,7 @@
       <w:color w:val="60a0b0"/>
     </w:rPr>
   </w:style>
-  <w:style w:type="character" w:customStyle="1" w:styleId="CommentVarTok">
+  <w:style w:customStyle="1" w:styleId="CommentVarTok" w:type="character">
     <w:name w:val="CommentVarTok"/>
     <w:basedOn w:val="VerbatimChar"/>
     <w:rPr>
@@ -6459,28 +6459,28 @@
       <w:color w:val="60a0b0"/>
     </w:rPr>
   </w:style>
-  <w:style w:type="character" w:customStyle="1" w:styleId="OtherTok">
+  <w:style w:customStyle="1" w:styleId="OtherTok" w:type="character">
     <w:name w:val="OtherTok"/>
     <w:basedOn w:val="VerbatimChar"/>
     <w:rPr>
       <w:color w:val="007020"/>
     </w:rPr>
   </w:style>
-  <w:style w:type="character" w:customStyle="1" w:styleId="FunctionTok">
+  <w:style w:customStyle="1" w:styleId="FunctionTok" w:type="character">
     <w:name w:val="FunctionTok"/>
     <w:basedOn w:val="VerbatimChar"/>
     <w:rPr>
       <w:color w:val="06287e"/>
     </w:rPr>
   </w:style>
-  <w:style w:type="character" w:customStyle="1" w:styleId="VariableTok">
+  <w:style w:customStyle="1" w:styleId="VariableTok" w:type="character">
     <w:name w:val="VariableTok"/>
     <w:basedOn w:val="VerbatimChar"/>
     <w:rPr>
       <w:color w:val="19177c"/>
     </w:rPr>
   </w:style>
-  <w:style w:type="character" w:customStyle="1" w:styleId="ControlFlowTok">
+  <w:style w:customStyle="1" w:styleId="ControlFlowTok" w:type="character">
     <w:name w:val="ControlFlowTok"/>
     <w:basedOn w:val="VerbatimChar"/>
     <w:rPr>
@@ -6488,45 +6488,45 @@
       <w:color w:val="007020"/>
     </w:rPr>
   </w:style>
-  <w:style w:type="character" w:customStyle="1" w:styleId="OperatorTok">
+  <w:style w:customStyle="1" w:styleId="OperatorTok" w:type="character">
     <w:name w:val="OperatorTok"/>
     <w:basedOn w:val="VerbatimChar"/>
     <w:rPr>
       <w:color w:val="666666"/>
     </w:rPr>
   </w:style>
-  <w:style w:type="character" w:customStyle="1" w:styleId="BuiltInTok">
+  <w:style w:customStyle="1" w:styleId="BuiltInTok" w:type="character">
     <w:name w:val="BuiltInTok"/>
     <w:basedOn w:val="VerbatimChar"/>
     <w:rPr>
       <w:color w:val="008000"/>
     </w:rPr>
   </w:style>
-  <w:style w:type="character" w:customStyle="1" w:styleId="ExtensionTok">
+  <w:style w:customStyle="1" w:styleId="ExtensionTok" w:type="character">
     <w:name w:val="ExtensionTok"/>
     <w:basedOn w:val="VerbatimChar"/>
     <w:rPr/>
   </w:style>
-  <w:style w:type="character" w:customStyle="1" w:styleId="PreprocessorTok">
+  <w:style w:customStyle="1" w:styleId="PreprocessorTok" w:type="character">
     <w:name w:val="PreprocessorTok"/>
     <w:basedOn w:val="VerbatimChar"/>
     <w:rPr>
       <w:color w:val="bc7a00"/>
     </w:rPr>
   </w:style>
-  <w:style w:type="character" w:customStyle="1" w:styleId="AttributeTok">
+  <w:style w:customStyle="1" w:styleId="AttributeTok" w:type="character">
     <w:name w:val="AttributeTok"/>
     <w:basedOn w:val="VerbatimChar"/>
     <w:rPr>
       <w:color w:val="7d9029"/>
     </w:rPr>
   </w:style>
-  <w:style w:type="character" w:customStyle="1" w:styleId="RegionMarkerTok">
+  <w:style w:customStyle="1" w:styleId="RegionMarkerTok" w:type="character">
     <w:name w:val="RegionMarkerTok"/>
     <w:basedOn w:val="VerbatimChar"/>
     <w:rPr/>
   </w:style>
-  <w:style w:type="character" w:customStyle="1" w:styleId="InformationTok">
+  <w:style w:customStyle="1" w:styleId="InformationTok" w:type="character">
     <w:name w:val="InformationTok"/>
     <w:basedOn w:val="VerbatimChar"/>
     <w:rPr>
@@ -6535,7 +6535,7 @@
       <w:color w:val="60a0b0"/>
     </w:rPr>
   </w:style>
-  <w:style w:type="character" w:customStyle="1" w:styleId="WarningTok">
+  <w:style w:customStyle="1" w:styleId="WarningTok" w:type="character">
     <w:name w:val="WarningTok"/>
     <w:basedOn w:val="VerbatimChar"/>
     <w:rPr>
@@ -6544,7 +6544,7 @@
       <w:color w:val="60a0b0"/>
     </w:rPr>
   </w:style>
-  <w:style w:type="character" w:customStyle="1" w:styleId="AlertTok">
+  <w:style w:customStyle="1" w:styleId="AlertTok" w:type="character">
     <w:name w:val="AlertTok"/>
     <w:basedOn w:val="VerbatimChar"/>
     <w:rPr>
@@ -6552,7 +6552,7 @@
       <w:color w:val="ff0000"/>
     </w:rPr>
   </w:style>
-  <w:style w:type="character" w:customStyle="1" w:styleId="ErrorTok">
+  <w:style w:customStyle="1" w:styleId="ErrorTok" w:type="character">
     <w:name w:val="ErrorTok"/>
     <w:basedOn w:val="VerbatimChar"/>
     <w:rPr>
@@ -6560,7 +6560,7 @@
       <w:color w:val="ff0000"/>
     </w:rPr>
   </w:style>
-  <w:style w:type="character" w:customStyle="1" w:styleId="NormalTok">
+  <w:style w:customStyle="1" w:styleId="NormalTok" w:type="character">
     <w:name w:val="NormalTok"/>
     <w:basedOn w:val="VerbatimChar"/>
     <w:rPr/>

</xml_diff>

<commit_message>
docs(artifacts): recount commits, files and services as of October 20
</commit_message>
<xml_diff>
--- a/05_ARTEFACTOS_DE_CODIGO/EN/WORD/05_Code_Artifacts.docx
+++ b/05_ARTEFACTOS_DE_CODIGO/EN/WORD/05_Code_Artifacts.docx
@@ -196,7 +196,7 @@
               <w:pStyle w:val="Compact"/>
             </w:pPr>
             <w:r>
-              <w:t xml:space="preserve">Brayan Estiven Patiño Cabrera, Juan Camilo Guilombo Osorio, Merari Urbano</w:t>
+              <w:t xml:space="preserve">Brayan Estiven Patiño Cabrera, Juan Camilo Guilombo Osorio, Merari Urbano Quintero</w:t>
             </w:r>
           </w:p>
         </w:tc>
@@ -268,7 +268,7 @@
               <w:pStyle w:val="Compact"/>
             </w:pPr>
             <w:r>
-              <w:t xml:space="preserve">October 17, 2026</w:t>
+              <w:t xml:space="preserve">October 20, 2026</w:t>
             </w:r>
           </w:p>
         </w:tc>
@@ -279,7 +279,58 @@
         <w:pStyle w:val="BodyText"/>
       </w:pPr>
       <w:r>
-        <w:t xml:space="preserve">The system's code lives in 10 GitHub repositories: the web application, the mobile application, and 8 backend repositories. This document inventories the two clients and explains how to build and run them; the backend is described only as far as the clients need it. Source code is not reproduced.</w:t>
+        <w:t xml:space="preserve">The system's code lives in 10 GitHub repositories: the web application, the mobile application, and 8 backend repositories. Each one has a GitHub Actions workflow (</w:t>
+      </w:r>
+      <w:r>
+        <w:rPr>
+          <w:rStyle w:val="VerbatimChar"/>
+        </w:rPr>
+        <w:t xml:space="preserve">.github/workflows/ci.yml</w:t>
+      </w:r>
+      <w:r>
+        <w:t xml:space="preserve">) that builds it and runs its tests on every change (in</w:t>
+      </w:r>
+      <w:r>
+        <w:t xml:space="preserve"> </w:t>
+      </w:r>
+      <w:r>
+        <w:rPr>
+          <w:rStyle w:val="VerbatimChar"/>
+        </w:rPr>
+        <w:t xml:space="preserve">lavarapido-infra</w:t>
+      </w:r>
+      <w:r>
+        <w:t xml:space="preserve"> </w:t>
+      </w:r>
+      <w:r>
+        <w:t xml:space="preserve">it validates the deploy scripts, the Docker Compose files and the end-to-end test syntax);</w:t>
+      </w:r>
+      <w:r>
+        <w:t xml:space="preserve"> </w:t>
+      </w:r>
+      <w:r>
+        <w:rPr>
+          <w:rStyle w:val="VerbatimChar"/>
+        </w:rPr>
+        <w:t xml:space="preserve">lavarapido-infra</w:t>
+      </w:r>
+      <w:r>
+        <w:t xml:space="preserve"> </w:t>
+      </w:r>
+      <w:r>
+        <w:t xml:space="preserve">also has</w:t>
+      </w:r>
+      <w:r>
+        <w:t xml:space="preserve"> </w:t>
+      </w:r>
+      <w:r>
+        <w:rPr>
+          <w:rStyle w:val="VerbatimChar"/>
+        </w:rPr>
+        <w:t xml:space="preserve">deploy.yml</w:t>
+      </w:r>
+      <w:r>
+        <w:t xml:space="preserve">, a workflow started by hand to update the server. This document inventories the two clients and explains how to build and run them; the backend is described only as far as the clients need it. Source code is not reproduced.</w:t>
       </w:r>
     </w:p>
     <w:bookmarkEnd w:id="20"/>
@@ -335,7 +386,7 @@
           <w:i/>
           <w:iCs/>
         </w:rPr>
-        <w:t xml:space="preserve">branch, as of October 15, 2026)</w:t>
+        <w:t xml:space="preserve">branch, as of October 20, 2026)</w:t>
       </w:r>
     </w:p>
     <w:tbl>
@@ -457,18 +508,18 @@
               <w:pStyle w:val="Compact"/>
             </w:pPr>
             <w:r>
-              <w:t xml:space="preserve">409</w:t>
-            </w:r>
-          </w:p>
-        </w:tc>
-        <w:tc>
-          <w:tcPr/>
-          <w:p>
-            <w:pPr>
-              <w:pStyle w:val="Compact"/>
-            </w:pPr>
-            <w:r>
-              <w:t xml:space="preserve">2026-10-17</w:t>
+              <w:t xml:space="preserve">449</w:t>
+            </w:r>
+          </w:p>
+        </w:tc>
+        <w:tc>
+          <w:tcPr/>
+          <w:p>
+            <w:pPr>
+              <w:pStyle w:val="Compact"/>
+            </w:pPr>
+            <w:r>
+              <w:t xml:space="preserve">2026-10-20</w:t>
             </w:r>
           </w:p>
         </w:tc>
@@ -519,18 +570,18 @@
               <w:pStyle w:val="Compact"/>
             </w:pPr>
             <w:r>
-              <w:t xml:space="preserve">181</w:t>
-            </w:r>
-          </w:p>
-        </w:tc>
-        <w:tc>
-          <w:tcPr/>
-          <w:p>
-            <w:pPr>
-              <w:pStyle w:val="Compact"/>
-            </w:pPr>
-            <w:r>
-              <w:t xml:space="preserve">2026-10-17</w:t>
+              <w:t xml:space="preserve">221</w:t>
+            </w:r>
+          </w:p>
+        </w:tc>
+        <w:tc>
+          <w:tcPr/>
+          <w:p>
+            <w:pPr>
+              <w:pStyle w:val="Compact"/>
+            </w:pPr>
+            <w:r>
+              <w:t xml:space="preserve">2026-10-20</w:t>
             </w:r>
           </w:p>
         </w:tc>
@@ -581,18 +632,18 @@
               <w:pStyle w:val="Compact"/>
             </w:pPr>
             <w:r>
-              <w:t xml:space="preserve">59</w:t>
-            </w:r>
-          </w:p>
-        </w:tc>
-        <w:tc>
-          <w:tcPr/>
-          <w:p>
-            <w:pPr>
-              <w:pStyle w:val="Compact"/>
-            </w:pPr>
-            <w:r>
-              <w:t xml:space="preserve">2026-10-17</w:t>
+              <w:t xml:space="preserve">68</w:t>
+            </w:r>
+          </w:p>
+        </w:tc>
+        <w:tc>
+          <w:tcPr/>
+          <w:p>
+            <w:pPr>
+              <w:pStyle w:val="Compact"/>
+            </w:pPr>
+            <w:r>
+              <w:t xml:space="preserve">2026-10-19</w:t>
             </w:r>
           </w:p>
         </w:tc>
@@ -643,18 +694,18 @@
               <w:pStyle w:val="Compact"/>
             </w:pPr>
             <w:r>
-              <w:t xml:space="preserve">12</w:t>
-            </w:r>
-          </w:p>
-        </w:tc>
-        <w:tc>
-          <w:tcPr/>
-          <w:p>
-            <w:pPr>
-              <w:pStyle w:val="Compact"/>
-            </w:pPr>
-            <w:r>
-              <w:t xml:space="preserve">2026-10-17</w:t>
+              <w:t xml:space="preserve">16</w:t>
+            </w:r>
+          </w:p>
+        </w:tc>
+        <w:tc>
+          <w:tcPr/>
+          <w:p>
+            <w:pPr>
+              <w:pStyle w:val="Compact"/>
+            </w:pPr>
+            <w:r>
+              <w:t xml:space="preserve">2026-10-19</w:t>
             </w:r>
           </w:p>
         </w:tc>
@@ -705,18 +756,18 @@
               <w:pStyle w:val="Compact"/>
             </w:pPr>
             <w:r>
-              <w:t xml:space="preserve">50</w:t>
-            </w:r>
-          </w:p>
-        </w:tc>
-        <w:tc>
-          <w:tcPr/>
-          <w:p>
-            <w:pPr>
-              <w:pStyle w:val="Compact"/>
-            </w:pPr>
-            <w:r>
-              <w:t xml:space="preserve">2026-10-17</w:t>
+              <w:t xml:space="preserve">60</w:t>
+            </w:r>
+          </w:p>
+        </w:tc>
+        <w:tc>
+          <w:tcPr/>
+          <w:p>
+            <w:pPr>
+              <w:pStyle w:val="Compact"/>
+            </w:pPr>
+            <w:r>
+              <w:t xml:space="preserve">2026-10-20</w:t>
             </w:r>
           </w:p>
         </w:tc>
@@ -767,18 +818,18 @@
               <w:pStyle w:val="Compact"/>
             </w:pPr>
             <w:r>
-              <w:t xml:space="preserve">18</w:t>
-            </w:r>
-          </w:p>
-        </w:tc>
-        <w:tc>
-          <w:tcPr/>
-          <w:p>
-            <w:pPr>
-              <w:pStyle w:val="Compact"/>
-            </w:pPr>
-            <w:r>
-              <w:t xml:space="preserve">2026-10-17</w:t>
+              <w:t xml:space="preserve">22</w:t>
+            </w:r>
+          </w:p>
+        </w:tc>
+        <w:tc>
+          <w:tcPr/>
+          <w:p>
+            <w:pPr>
+              <w:pStyle w:val="Compact"/>
+            </w:pPr>
+            <w:r>
+              <w:t xml:space="preserve">2026-10-19</w:t>
             </w:r>
           </w:p>
         </w:tc>
@@ -829,18 +880,18 @@
               <w:pStyle w:val="Compact"/>
             </w:pPr>
             <w:r>
-              <w:t xml:space="preserve">46</w:t>
-            </w:r>
-          </w:p>
-        </w:tc>
-        <w:tc>
-          <w:tcPr/>
-          <w:p>
-            <w:pPr>
-              <w:pStyle w:val="Compact"/>
-            </w:pPr>
-            <w:r>
-              <w:t xml:space="preserve">2026-10-17</w:t>
+              <w:t xml:space="preserve">54</w:t>
+            </w:r>
+          </w:p>
+        </w:tc>
+        <w:tc>
+          <w:tcPr/>
+          <w:p>
+            <w:pPr>
+              <w:pStyle w:val="Compact"/>
+            </w:pPr>
+            <w:r>
+              <w:t xml:space="preserve">2026-10-19</w:t>
             </w:r>
           </w:p>
         </w:tc>
@@ -891,18 +942,18 @@
               <w:pStyle w:val="Compact"/>
             </w:pPr>
             <w:r>
-              <w:t xml:space="preserve">36</w:t>
-            </w:r>
-          </w:p>
-        </w:tc>
-        <w:tc>
-          <w:tcPr/>
-          <w:p>
-            <w:pPr>
-              <w:pStyle w:val="Compact"/>
-            </w:pPr>
-            <w:r>
-              <w:t xml:space="preserve">2026-10-17</w:t>
+              <w:t xml:space="preserve">42</w:t>
+            </w:r>
+          </w:p>
+        </w:tc>
+        <w:tc>
+          <w:tcPr/>
+          <w:p>
+            <w:pPr>
+              <w:pStyle w:val="Compact"/>
+            </w:pPr>
+            <w:r>
+              <w:t xml:space="preserve">2026-10-19</w:t>
             </w:r>
           </w:p>
         </w:tc>
@@ -953,18 +1004,18 @@
               <w:pStyle w:val="Compact"/>
             </w:pPr>
             <w:r>
-              <w:t xml:space="preserve">40</w:t>
-            </w:r>
-          </w:p>
-        </w:tc>
-        <w:tc>
-          <w:tcPr/>
-          <w:p>
-            <w:pPr>
-              <w:pStyle w:val="Compact"/>
-            </w:pPr>
-            <w:r>
-              <w:t xml:space="preserve">2026-10-17</w:t>
+              <w:t xml:space="preserve">46</w:t>
+            </w:r>
+          </w:p>
+        </w:tc>
+        <w:tc>
+          <w:tcPr/>
+          <w:p>
+            <w:pPr>
+              <w:pStyle w:val="Compact"/>
+            </w:pPr>
+            <w:r>
+              <w:t xml:space="preserve">2026-10-19</w:t>
             </w:r>
           </w:p>
         </w:tc>
@@ -1015,18 +1066,18 @@
               <w:pStyle w:val="Compact"/>
             </w:pPr>
             <w:r>
-              <w:t xml:space="preserve">35</w:t>
-            </w:r>
-          </w:p>
-        </w:tc>
-        <w:tc>
-          <w:tcPr/>
-          <w:p>
-            <w:pPr>
-              <w:pStyle w:val="Compact"/>
-            </w:pPr>
-            <w:r>
-              <w:t xml:space="preserve">2026-10-17</w:t>
+              <w:t xml:space="preserve">39</w:t>
+            </w:r>
+          </w:p>
+        </w:tc>
+        <w:tc>
+          <w:tcPr/>
+          <w:p>
+            <w:pPr>
+              <w:pStyle w:val="Compact"/>
+            </w:pPr>
+            <w:r>
+              <w:t xml:space="preserve">2026-10-19</w:t>
             </w:r>
           </w:p>
         </w:tc>
@@ -1190,18 +1241,18 @@
               <w:pStyle w:val="Compact"/>
             </w:pPr>
             <w:r>
-              <w:t xml:space="preserve">433</w:t>
-            </w:r>
-          </w:p>
-        </w:tc>
-        <w:tc>
-          <w:tcPr/>
-          <w:p>
-            <w:pPr>
-              <w:pStyle w:val="Compact"/>
-            </w:pPr>
-            <w:r>
-              <w:t xml:space="preserve">46,308</w:t>
+              <w:t xml:space="preserve">442</w:t>
+            </w:r>
+          </w:p>
+        </w:tc>
+        <w:tc>
+          <w:tcPr/>
+          <w:p>
+            <w:pPr>
+              <w:pStyle w:val="Compact"/>
+            </w:pPr>
+            <w:r>
+              <w:t xml:space="preserve">47,100</w:t>
             </w:r>
           </w:p>
         </w:tc>
@@ -1245,18 +1296,18 @@
               <w:pStyle w:val="Compact"/>
             </w:pPr>
             <w:r>
-              <w:t xml:space="preserve">291</w:t>
-            </w:r>
-          </w:p>
-        </w:tc>
-        <w:tc>
-          <w:tcPr/>
-          <w:p>
-            <w:pPr>
-              <w:pStyle w:val="Compact"/>
-            </w:pPr>
-            <w:r>
-              <w:t xml:space="preserve">34,318</w:t>
+              <w:t xml:space="preserve">293</w:t>
+            </w:r>
+          </w:p>
+        </w:tc>
+        <w:tc>
+          <w:tcPr/>
+          <w:p>
+            <w:pPr>
+              <w:pStyle w:val="Compact"/>
+            </w:pPr>
+            <w:r>
+              <w:t xml:space="preserve">34,884</w:t>
             </w:r>
           </w:p>
         </w:tc>
@@ -1288,7 +1339,7 @@
         <w:t xml:space="preserve"> </w:t>
       </w:r>
       <w:r>
-        <w:t xml:space="preserve">Count of October 17, 2026, with</w:t>
+        <w:t xml:space="preserve">Count of October 20, 2026, with</w:t>
       </w:r>
       <w:r>
         <w:t xml:space="preserve"> </w:t>
@@ -1611,7 +1662,7 @@
               <w:pStyle w:val="Compact"/>
             </w:pPr>
             <w:r>
-              <w:t xml:space="preserve">16 HTTP and state services:</w:t>
+              <w:t xml:space="preserve">17 HTTP and state services:</w:t>
             </w:r>
             <w:r>
               <w:t xml:space="preserve"> </w:t>
@@ -1789,6 +1840,18 @@
                 <w:rStyle w:val="VerbatimChar"/>
               </w:rPr>
               <w:t xml:space="preserve">local-storage</w:t>
+            </w:r>
+            <w:r>
+              <w:t xml:space="preserve">,</w:t>
+            </w:r>
+            <w:r>
+              <w:t xml:space="preserve"> </w:t>
+            </w:r>
+            <w:r>
+              <w:rPr>
+                <w:rStyle w:val="VerbatimChar"/>
+              </w:rPr>
+              <w:t xml:space="preserve">notification-watcher</w:t>
             </w:r>
             <w:r>
               <w:t xml:space="preserve">,</w:t>
@@ -5340,7 +5403,7 @@
               <w:rPr>
                 <w:rStyle w:val="VerbatimChar"/>
               </w:rPr>
-              <w:t xml:space="preserve">Program.cs:50-55</w:t>
+              <w:t xml:space="preserve">Program.cs:53-57</w:t>
             </w:r>
             <w:r>
               <w:t xml:space="preserve">)</w:t>
@@ -5435,7 +5498,7 @@
         <w:t xml:space="preserve"> </w:t>
       </w:r>
       <w:r>
-        <w:t xml:space="preserve">has three Node 22 scripts: the cross-service booking flow (</w:t>
+        <w:t xml:space="preserve">has three kinds of Node 22 scripts: the 19 end-to-end tests (</w:t>
       </w:r>
       <w:r>
         <w:rPr>
@@ -5444,7 +5507,7 @@
         <w:t xml:space="preserve">node --test "e2e/*.test.js"</w:t>
       </w:r>
       <w:r>
-        <w:t xml:space="preserve">), the response time measurement (</w:t>
+        <w:t xml:space="preserve">: cross-service booking flow, full flow of the three roles, inspection report and access rules), the response time measurement (</w:t>
       </w:r>
       <w:r>
         <w:rPr>
@@ -6585,7 +6648,7 @@
       <w:color w:themeColor="accent1" w:themeShade="BF" w:val="365F91"/>
     </w:rPr>
   </w:style>
-  <w:style w:type="paragraph" w:customStyle="1" w:styleId="SourceCode">
+  <w:style w:customStyle="1" w:styleId="SourceCode" w:type="paragraph">
     <w:name w:val="Source Code"/>
     <w:basedOn w:val="Normal"/>
     <w:link w:val="VerbatimChar"/>
@@ -6593,7 +6656,7 @@
       <w:wordWrap w:val="off"/>
     </w:pPr>
   </w:style>
-  <w:style w:type="character" w:customStyle="1" w:styleId="KeywordTok">
+  <w:style w:customStyle="1" w:styleId="KeywordTok" w:type="character">
     <w:name w:val="KeywordTok"/>
     <w:basedOn w:val="VerbatimChar"/>
     <w:rPr>
@@ -6601,77 +6664,77 @@
       <w:color w:val="007020"/>
     </w:rPr>
   </w:style>
-  <w:style w:type="character" w:customStyle="1" w:styleId="DataTypeTok">
+  <w:style w:customStyle="1" w:styleId="DataTypeTok" w:type="character">
     <w:name w:val="DataTypeTok"/>
     <w:basedOn w:val="VerbatimChar"/>
     <w:rPr>
       <w:color w:val="902000"/>
     </w:rPr>
   </w:style>
-  <w:style w:type="character" w:customStyle="1" w:styleId="DecValTok">
+  <w:style w:customStyle="1" w:styleId="DecValTok" w:type="character">
     <w:name w:val="DecValTok"/>
     <w:basedOn w:val="VerbatimChar"/>
     <w:rPr>
       <w:color w:val="40a070"/>
     </w:rPr>
   </w:style>
-  <w:style w:type="character" w:customStyle="1" w:styleId="BaseNTok">
+  <w:style w:customStyle="1" w:styleId="BaseNTok" w:type="character">
     <w:name w:val="BaseNTok"/>
     <w:basedOn w:val="VerbatimChar"/>
     <w:rPr>
       <w:color w:val="40a070"/>
     </w:rPr>
   </w:style>
-  <w:style w:type="character" w:customStyle="1" w:styleId="FloatTok">
+  <w:style w:customStyle="1" w:styleId="FloatTok" w:type="character">
     <w:name w:val="FloatTok"/>
     <w:basedOn w:val="VerbatimChar"/>
     <w:rPr>
       <w:color w:val="40a070"/>
     </w:rPr>
   </w:style>
-  <w:style w:type="character" w:customStyle="1" w:styleId="ConstantTok">
+  <w:style w:customStyle="1" w:styleId="ConstantTok" w:type="character">
     <w:name w:val="ConstantTok"/>
     <w:basedOn w:val="VerbatimChar"/>
     <w:rPr>
       <w:color w:val="880000"/>
     </w:rPr>
   </w:style>
-  <w:style w:type="character" w:customStyle="1" w:styleId="CharTok">
+  <w:style w:customStyle="1" w:styleId="CharTok" w:type="character">
     <w:name w:val="CharTok"/>
     <w:basedOn w:val="VerbatimChar"/>
     <w:rPr>
       <w:color w:val="4070a0"/>
     </w:rPr>
   </w:style>
-  <w:style w:type="character" w:customStyle="1" w:styleId="SpecialCharTok">
+  <w:style w:customStyle="1" w:styleId="SpecialCharTok" w:type="character">
     <w:name w:val="SpecialCharTok"/>
     <w:basedOn w:val="VerbatimChar"/>
     <w:rPr>
       <w:color w:val="4070a0"/>
     </w:rPr>
   </w:style>
-  <w:style w:type="character" w:customStyle="1" w:styleId="StringTok">
+  <w:style w:customStyle="1" w:styleId="StringTok" w:type="character">
     <w:name w:val="StringTok"/>
     <w:basedOn w:val="VerbatimChar"/>
     <w:rPr>
       <w:color w:val="4070a0"/>
     </w:rPr>
   </w:style>
-  <w:style w:type="character" w:customStyle="1" w:styleId="VerbatimStringTok">
+  <w:style w:customStyle="1" w:styleId="VerbatimStringTok" w:type="character">
     <w:name w:val="VerbatimStringTok"/>
     <w:basedOn w:val="VerbatimChar"/>
     <w:rPr>
       <w:color w:val="4070a0"/>
     </w:rPr>
   </w:style>
-  <w:style w:type="character" w:customStyle="1" w:styleId="SpecialStringTok">
+  <w:style w:customStyle="1" w:styleId="SpecialStringTok" w:type="character">
     <w:name w:val="SpecialStringTok"/>
     <w:basedOn w:val="VerbatimChar"/>
     <w:rPr>
       <w:color w:val="bb6688"/>
     </w:rPr>
   </w:style>
-  <w:style w:type="character" w:customStyle="1" w:styleId="ImportTok">
+  <w:style w:customStyle="1" w:styleId="ImportTok" w:type="character">
     <w:name w:val="ImportTok"/>
     <w:basedOn w:val="VerbatimChar"/>
     <w:rPr>
@@ -6679,7 +6742,7 @@
       <w:color w:val="008000"/>
     </w:rPr>
   </w:style>
-  <w:style w:type="character" w:customStyle="1" w:styleId="CommentTok">
+  <w:style w:customStyle="1" w:styleId="CommentTok" w:type="character">
     <w:name w:val="CommentTok"/>
     <w:basedOn w:val="VerbatimChar"/>
     <w:rPr>
@@ -6687,7 +6750,7 @@
       <w:color w:val="60a0b0"/>
     </w:rPr>
   </w:style>
-  <w:style w:type="character" w:customStyle="1" w:styleId="DocumentationTok">
+  <w:style w:customStyle="1" w:styleId="DocumentationTok" w:type="character">
     <w:name w:val="DocumentationTok"/>
     <w:basedOn w:val="VerbatimChar"/>
     <w:rPr>
@@ -6695,7 +6758,7 @@
       <w:color w:val="ba2121"/>
     </w:rPr>
   </w:style>
-  <w:style w:type="character" w:customStyle="1" w:styleId="AnnotationTok">
+  <w:style w:customStyle="1" w:styleId="AnnotationTok" w:type="character">
     <w:name w:val="AnnotationTok"/>
     <w:basedOn w:val="VerbatimChar"/>
     <w:rPr>
@@ -6704,7 +6767,7 @@
       <w:color w:val="60a0b0"/>
     </w:rPr>
   </w:style>
-  <w:style w:type="character" w:customStyle="1" w:styleId="CommentVarTok">
+  <w:style w:customStyle="1" w:styleId="CommentVarTok" w:type="character">
     <w:name w:val="CommentVarTok"/>
     <w:basedOn w:val="VerbatimChar"/>
     <w:rPr>
@@ -6713,28 +6776,28 @@
       <w:color w:val="60a0b0"/>
     </w:rPr>
   </w:style>
-  <w:style w:type="character" w:customStyle="1" w:styleId="OtherTok">
+  <w:style w:customStyle="1" w:styleId="OtherTok" w:type="character">
     <w:name w:val="OtherTok"/>
     <w:basedOn w:val="VerbatimChar"/>
     <w:rPr>
       <w:color w:val="007020"/>
     </w:rPr>
   </w:style>
-  <w:style w:type="character" w:customStyle="1" w:styleId="FunctionTok">
+  <w:style w:customStyle="1" w:styleId="FunctionTok" w:type="character">
     <w:name w:val="FunctionTok"/>
     <w:basedOn w:val="VerbatimChar"/>
     <w:rPr>
       <w:color w:val="06287e"/>
     </w:rPr>
   </w:style>
-  <w:style w:type="character" w:customStyle="1" w:styleId="VariableTok">
+  <w:style w:customStyle="1" w:styleId="VariableTok" w:type="character">
     <w:name w:val="VariableTok"/>
     <w:basedOn w:val="VerbatimChar"/>
     <w:rPr>
       <w:color w:val="19177c"/>
     </w:rPr>
   </w:style>
-  <w:style w:type="character" w:customStyle="1" w:styleId="ControlFlowTok">
+  <w:style w:customStyle="1" w:styleId="ControlFlowTok" w:type="character">
     <w:name w:val="ControlFlowTok"/>
     <w:basedOn w:val="VerbatimChar"/>
     <w:rPr>
@@ -6742,45 +6805,45 @@
       <w:color w:val="007020"/>
     </w:rPr>
   </w:style>
-  <w:style w:type="character" w:customStyle="1" w:styleId="OperatorTok">
+  <w:style w:customStyle="1" w:styleId="OperatorTok" w:type="character">
     <w:name w:val="OperatorTok"/>
     <w:basedOn w:val="VerbatimChar"/>
     <w:rPr>
       <w:color w:val="666666"/>
     </w:rPr>
   </w:style>
-  <w:style w:type="character" w:customStyle="1" w:styleId="BuiltInTok">
+  <w:style w:customStyle="1" w:styleId="BuiltInTok" w:type="character">
     <w:name w:val="BuiltInTok"/>
     <w:basedOn w:val="VerbatimChar"/>
     <w:rPr>
       <w:color w:val="008000"/>
     </w:rPr>
   </w:style>
-  <w:style w:type="character" w:customStyle="1" w:styleId="ExtensionTok">
+  <w:style w:customStyle="1" w:styleId="ExtensionTok" w:type="character">
     <w:name w:val="ExtensionTok"/>
     <w:basedOn w:val="VerbatimChar"/>
     <w:rPr/>
   </w:style>
-  <w:style w:type="character" w:customStyle="1" w:styleId="PreprocessorTok">
+  <w:style w:customStyle="1" w:styleId="PreprocessorTok" w:type="character">
     <w:name w:val="PreprocessorTok"/>
     <w:basedOn w:val="VerbatimChar"/>
     <w:rPr>
       <w:color w:val="bc7a00"/>
     </w:rPr>
   </w:style>
-  <w:style w:type="character" w:customStyle="1" w:styleId="AttributeTok">
+  <w:style w:customStyle="1" w:styleId="AttributeTok" w:type="character">
     <w:name w:val="AttributeTok"/>
     <w:basedOn w:val="VerbatimChar"/>
     <w:rPr>
       <w:color w:val="7d9029"/>
     </w:rPr>
   </w:style>
-  <w:style w:type="character" w:customStyle="1" w:styleId="RegionMarkerTok">
+  <w:style w:customStyle="1" w:styleId="RegionMarkerTok" w:type="character">
     <w:name w:val="RegionMarkerTok"/>
     <w:basedOn w:val="VerbatimChar"/>
     <w:rPr/>
   </w:style>
-  <w:style w:type="character" w:customStyle="1" w:styleId="InformationTok">
+  <w:style w:customStyle="1" w:styleId="InformationTok" w:type="character">
     <w:name w:val="InformationTok"/>
     <w:basedOn w:val="VerbatimChar"/>
     <w:rPr>
@@ -6789,7 +6852,7 @@
       <w:color w:val="60a0b0"/>
     </w:rPr>
   </w:style>
-  <w:style w:type="character" w:customStyle="1" w:styleId="WarningTok">
+  <w:style w:customStyle="1" w:styleId="WarningTok" w:type="character">
     <w:name w:val="WarningTok"/>
     <w:basedOn w:val="VerbatimChar"/>
     <w:rPr>
@@ -6798,7 +6861,7 @@
       <w:color w:val="60a0b0"/>
     </w:rPr>
   </w:style>
-  <w:style w:type="character" w:customStyle="1" w:styleId="AlertTok">
+  <w:style w:customStyle="1" w:styleId="AlertTok" w:type="character">
     <w:name w:val="AlertTok"/>
     <w:basedOn w:val="VerbatimChar"/>
     <w:rPr>
@@ -6806,7 +6869,7 @@
       <w:color w:val="ff0000"/>
     </w:rPr>
   </w:style>
-  <w:style w:type="character" w:customStyle="1" w:styleId="ErrorTok">
+  <w:style w:customStyle="1" w:styleId="ErrorTok" w:type="character">
     <w:name w:val="ErrorTok"/>
     <w:basedOn w:val="VerbatimChar"/>
     <w:rPr>
@@ -6814,7 +6877,7 @@
       <w:color w:val="ff0000"/>
     </w:rPr>
   </w:style>
-  <w:style w:type="character" w:customStyle="1" w:styleId="NormalTok">
+  <w:style w:customStyle="1" w:styleId="NormalTok" w:type="character">
     <w:name w:val="NormalTok"/>
     <w:basedOn w:val="VerbatimChar"/>
     <w:rPr/>

</xml_diff>

<commit_message>
docs(code-artifacts): update the English code artifacts with the October 21 evening changes
</commit_message>
<xml_diff>
--- a/05_ARTEFACTOS_DE_CODIGO/EN/WORD/05_Code_Artifacts.docx
+++ b/05_ARTEFACTOS_DE_CODIGO/EN/WORD/05_Code_Artifacts.docx
@@ -268,7 +268,7 @@
               <w:pStyle w:val="Compact"/>
             </w:pPr>
             <w:r>
-              <w:t xml:space="preserve">October 20, 2026</w:t>
+              <w:t xml:space="preserve">October 21, 2026</w:t>
             </w:r>
           </w:p>
         </w:tc>
@@ -386,7 +386,7 @@
           <w:i/>
           <w:iCs/>
         </w:rPr>
-        <w:t xml:space="preserve">branch, as of October 20, 2026)</w:t>
+        <w:t xml:space="preserve">branch, as of October 21, 2026)</w:t>
       </w:r>
     </w:p>
     <w:tbl>
@@ -508,18 +508,18 @@
               <w:pStyle w:val="Compact"/>
             </w:pPr>
             <w:r>
-              <w:t xml:space="preserve">449</w:t>
-            </w:r>
-          </w:p>
-        </w:tc>
-        <w:tc>
-          <w:tcPr/>
-          <w:p>
-            <w:pPr>
-              <w:pStyle w:val="Compact"/>
-            </w:pPr>
-            <w:r>
-              <w:t xml:space="preserve">2026-10-20</w:t>
+              <w:t xml:space="preserve">474</w:t>
+            </w:r>
+          </w:p>
+        </w:tc>
+        <w:tc>
+          <w:tcPr/>
+          <w:p>
+            <w:pPr>
+              <w:pStyle w:val="Compact"/>
+            </w:pPr>
+            <w:r>
+              <w:t xml:space="preserve">2026-10-21</w:t>
             </w:r>
           </w:p>
         </w:tc>
@@ -570,18 +570,18 @@
               <w:pStyle w:val="Compact"/>
             </w:pPr>
             <w:r>
-              <w:t xml:space="preserve">221</w:t>
-            </w:r>
-          </w:p>
-        </w:tc>
-        <w:tc>
-          <w:tcPr/>
-          <w:p>
-            <w:pPr>
-              <w:pStyle w:val="Compact"/>
-            </w:pPr>
-            <w:r>
-              <w:t xml:space="preserve">2026-10-20</w:t>
+              <w:t xml:space="preserve">236</w:t>
+            </w:r>
+          </w:p>
+        </w:tc>
+        <w:tc>
+          <w:tcPr/>
+          <w:p>
+            <w:pPr>
+              <w:pStyle w:val="Compact"/>
+            </w:pPr>
+            <w:r>
+              <w:t xml:space="preserve">2026-10-21</w:t>
             </w:r>
           </w:p>
         </w:tc>
@@ -632,18 +632,18 @@
               <w:pStyle w:val="Compact"/>
             </w:pPr>
             <w:r>
-              <w:t xml:space="preserve">68</w:t>
-            </w:r>
-          </w:p>
-        </w:tc>
-        <w:tc>
-          <w:tcPr/>
-          <w:p>
-            <w:pPr>
-              <w:pStyle w:val="Compact"/>
-            </w:pPr>
-            <w:r>
-              <w:t xml:space="preserve">2026-10-19</w:t>
+              <w:t xml:space="preserve">86</w:t>
+            </w:r>
+          </w:p>
+        </w:tc>
+        <w:tc>
+          <w:tcPr/>
+          <w:p>
+            <w:pPr>
+              <w:pStyle w:val="Compact"/>
+            </w:pPr>
+            <w:r>
+              <w:t xml:space="preserve">2026-10-21</w:t>
             </w:r>
           </w:p>
         </w:tc>
@@ -694,18 +694,18 @@
               <w:pStyle w:val="Compact"/>
             </w:pPr>
             <w:r>
-              <w:t xml:space="preserve">16</w:t>
-            </w:r>
-          </w:p>
-        </w:tc>
-        <w:tc>
-          <w:tcPr/>
-          <w:p>
-            <w:pPr>
-              <w:pStyle w:val="Compact"/>
-            </w:pPr>
-            <w:r>
-              <w:t xml:space="preserve">2026-10-19</w:t>
+              <w:t xml:space="preserve">21</w:t>
+            </w:r>
+          </w:p>
+        </w:tc>
+        <w:tc>
+          <w:tcPr/>
+          <w:p>
+            <w:pPr>
+              <w:pStyle w:val="Compact"/>
+            </w:pPr>
+            <w:r>
+              <w:t xml:space="preserve">2026-10-21</w:t>
             </w:r>
           </w:p>
         </w:tc>
@@ -756,18 +756,18 @@
               <w:pStyle w:val="Compact"/>
             </w:pPr>
             <w:r>
-              <w:t xml:space="preserve">60</w:t>
-            </w:r>
-          </w:p>
-        </w:tc>
-        <w:tc>
-          <w:tcPr/>
-          <w:p>
-            <w:pPr>
-              <w:pStyle w:val="Compact"/>
-            </w:pPr>
-            <w:r>
-              <w:t xml:space="preserve">2026-10-20</w:t>
+              <w:t xml:space="preserve">63</w:t>
+            </w:r>
+          </w:p>
+        </w:tc>
+        <w:tc>
+          <w:tcPr/>
+          <w:p>
+            <w:pPr>
+              <w:pStyle w:val="Compact"/>
+            </w:pPr>
+            <w:r>
+              <w:t xml:space="preserve">2026-10-21</w:t>
             </w:r>
           </w:p>
         </w:tc>
@@ -880,18 +880,18 @@
               <w:pStyle w:val="Compact"/>
             </w:pPr>
             <w:r>
-              <w:t xml:space="preserve">54</w:t>
-            </w:r>
-          </w:p>
-        </w:tc>
-        <w:tc>
-          <w:tcPr/>
-          <w:p>
-            <w:pPr>
-              <w:pStyle w:val="Compact"/>
-            </w:pPr>
-            <w:r>
-              <w:t xml:space="preserve">2026-10-19</w:t>
+              <w:t xml:space="preserve">61</w:t>
+            </w:r>
+          </w:p>
+        </w:tc>
+        <w:tc>
+          <w:tcPr/>
+          <w:p>
+            <w:pPr>
+              <w:pStyle w:val="Compact"/>
+            </w:pPr>
+            <w:r>
+              <w:t xml:space="preserve">2026-10-21</w:t>
             </w:r>
           </w:p>
         </w:tc>
@@ -942,18 +942,18 @@
               <w:pStyle w:val="Compact"/>
             </w:pPr>
             <w:r>
-              <w:t xml:space="preserve">42</w:t>
-            </w:r>
-          </w:p>
-        </w:tc>
-        <w:tc>
-          <w:tcPr/>
-          <w:p>
-            <w:pPr>
-              <w:pStyle w:val="Compact"/>
-            </w:pPr>
-            <w:r>
-              <w:t xml:space="preserve">2026-10-19</w:t>
+              <w:t xml:space="preserve">50</w:t>
+            </w:r>
+          </w:p>
+        </w:tc>
+        <w:tc>
+          <w:tcPr/>
+          <w:p>
+            <w:pPr>
+              <w:pStyle w:val="Compact"/>
+            </w:pPr>
+            <w:r>
+              <w:t xml:space="preserve">2026-10-21</w:t>
             </w:r>
           </w:p>
         </w:tc>
@@ -1004,18 +1004,18 @@
               <w:pStyle w:val="Compact"/>
             </w:pPr>
             <w:r>
-              <w:t xml:space="preserve">46</w:t>
-            </w:r>
-          </w:p>
-        </w:tc>
-        <w:tc>
-          <w:tcPr/>
-          <w:p>
-            <w:pPr>
-              <w:pStyle w:val="Compact"/>
-            </w:pPr>
-            <w:r>
-              <w:t xml:space="preserve">2026-10-19</w:t>
+              <w:t xml:space="preserve">49</w:t>
+            </w:r>
+          </w:p>
+        </w:tc>
+        <w:tc>
+          <w:tcPr/>
+          <w:p>
+            <w:pPr>
+              <w:pStyle w:val="Compact"/>
+            </w:pPr>
+            <w:r>
+              <w:t xml:space="preserve">2026-10-21</w:t>
             </w:r>
           </w:p>
         </w:tc>
@@ -1066,18 +1066,18 @@
               <w:pStyle w:val="Compact"/>
             </w:pPr>
             <w:r>
-              <w:t xml:space="preserve">39</w:t>
-            </w:r>
-          </w:p>
-        </w:tc>
-        <w:tc>
-          <w:tcPr/>
-          <w:p>
-            <w:pPr>
-              <w:pStyle w:val="Compact"/>
-            </w:pPr>
-            <w:r>
-              <w:t xml:space="preserve">2026-10-19</w:t>
+              <w:t xml:space="preserve">42</w:t>
+            </w:r>
+          </w:p>
+        </w:tc>
+        <w:tc>
+          <w:tcPr/>
+          <w:p>
+            <w:pPr>
+              <w:pStyle w:val="Compact"/>
+            </w:pPr>
+            <w:r>
+              <w:t xml:space="preserve">2026-10-21</w:t>
             </w:r>
           </w:p>
         </w:tc>
@@ -1241,18 +1241,18 @@
               <w:pStyle w:val="Compact"/>
             </w:pPr>
             <w:r>
-              <w:t xml:space="preserve">442</w:t>
-            </w:r>
-          </w:p>
-        </w:tc>
-        <w:tc>
-          <w:tcPr/>
-          <w:p>
-            <w:pPr>
-              <w:pStyle w:val="Compact"/>
-            </w:pPr>
-            <w:r>
-              <w:t xml:space="preserve">47,100</w:t>
+              <w:t xml:space="preserve">449</w:t>
+            </w:r>
+          </w:p>
+        </w:tc>
+        <w:tc>
+          <w:tcPr/>
+          <w:p>
+            <w:pPr>
+              <w:pStyle w:val="Compact"/>
+            </w:pPr>
+            <w:r>
+              <w:t xml:space="preserve">48,202</w:t>
             </w:r>
           </w:p>
         </w:tc>
@@ -1296,18 +1296,18 @@
               <w:pStyle w:val="Compact"/>
             </w:pPr>
             <w:r>
-              <w:t xml:space="preserve">293</w:t>
-            </w:r>
-          </w:p>
-        </w:tc>
-        <w:tc>
-          <w:tcPr/>
-          <w:p>
-            <w:pPr>
-              <w:pStyle w:val="Compact"/>
-            </w:pPr>
-            <w:r>
-              <w:t xml:space="preserve">34,884</w:t>
+              <w:t xml:space="preserve">296</w:t>
+            </w:r>
+          </w:p>
+        </w:tc>
+        <w:tc>
+          <w:tcPr/>
+          <w:p>
+            <w:pPr>
+              <w:pStyle w:val="Compact"/>
+            </w:pPr>
+            <w:r>
+              <w:t xml:space="preserve">35,540</w:t>
             </w:r>
           </w:p>
         </w:tc>
@@ -1339,7 +1339,7 @@
         <w:t xml:space="preserve"> </w:t>
       </w:r>
       <w:r>
-        <w:t xml:space="preserve">Count of October 20, 2026, with</w:t>
+        <w:t xml:space="preserve">Count of October 21, 2026, with</w:t>
       </w:r>
       <w:r>
         <w:t xml:space="preserve"> </w:t>
@@ -1865,6 +1865,24 @@
               </w:rPr>
               <w:t xml:space="preserve">api</w:t>
             </w:r>
+            <w:r>
+              <w:t xml:space="preserve">;</w:t>
+            </w:r>
+            <w:r>
+              <w:t xml:space="preserve"> </w:t>
+            </w:r>
+            <w:r>
+              <w:rPr>
+                <w:rStyle w:val="VerbatimChar"/>
+              </w:rPr>
+              <w:t xml:space="preserve">auth</w:t>
+            </w:r>
+            <w:r>
+              <w:t xml:space="preserve"> </w:t>
+            </w:r>
+            <w:r>
+              <w:t xml:space="preserve">also follows sign-in and sign-out in the other tabs of the same browser</w:t>
+            </w:r>
           </w:p>
         </w:tc>
       </w:tr>
@@ -1902,7 +1920,19 @@
               <w:pStyle w:val="Compact"/>
             </w:pPr>
             <w:r>
-              <w:t xml:space="preserve">DTO interfaces and utilities (for example, API error translation)</w:t>
+              <w:t xml:space="preserve">DTO interfaces and utilities (for example, API error translation and</w:t>
+            </w:r>
+            <w:r>
+              <w:t xml:space="preserve"> </w:t>
+            </w:r>
+            <w:r>
+              <w:rPr>
+                <w:rStyle w:val="VerbatimChar"/>
+              </w:rPr>
+              <w:t xml:space="preserve">image-compress.ts</w:t>
+            </w:r>
+            <w:r>
+              <w:t xml:space="preserve">, which shrinks the receipt image to at most 2 MB before uploading it)</w:t>
             </w:r>
           </w:p>
         </w:tc>
@@ -3203,10 +3233,22 @@
               <w:t xml:space="preserve">AppProviders</w:t>
             </w:r>
             <w:r>
-              <w:t xml:space="preserve"> </w:t>
-            </w:r>
-            <w:r>
-              <w:t xml:space="preserve">and account preference sync</w:t>
+              <w:t xml:space="preserve">, sync of the account preferences and the push token, and</w:t>
+            </w:r>
+            <w:r>
+              <w:t xml:space="preserve"> </w:t>
+            </w:r>
+            <w:r>
+              <w:rPr>
+                <w:rStyle w:val="VerbatimChar"/>
+              </w:rPr>
+              <w:t xml:space="preserve">AppUpdatesCheck</w:t>
+            </w:r>
+            <w:r>
+              <w:t xml:space="preserve"> </w:t>
+            </w:r>
+            <w:r>
+              <w:t xml:space="preserve">(if the server published a newer APK, it must be installed before going on)</w:t>
             </w:r>
           </w:p>
         </w:tc>
@@ -3438,6 +3480,33 @@
               <w:t xml:space="preserve">payments</w:t>
             </w:r>
             <w:r>
+              <w:t xml:space="preserve"> </w:t>
+            </w:r>
+            <w:r>
+              <w:t xml:space="preserve">(with</w:t>
+            </w:r>
+            <w:r>
+              <w:t xml:space="preserve"> </w:t>
+            </w:r>
+            <w:r>
+              <w:rPr>
+                <w:rStyle w:val="VerbatimChar"/>
+              </w:rPr>
+              <w:t xml:space="preserve">receiptImage.ts</w:t>
+            </w:r>
+            <w:r>
+              <w:t xml:space="preserve">, which compresses the receipt to at most 2 MB),</w:t>
+            </w:r>
+            <w:r>
+              <w:t xml:space="preserve"> </w:t>
+            </w:r>
+            <w:r>
+              <w:rPr>
+                <w:rStyle w:val="VerbatimChar"/>
+              </w:rPr>
+              <w:t xml:space="preserve">notifications</w:t>
+            </w:r>
+            <w:r>
               <w:t xml:space="preserve">,</w:t>
             </w:r>
             <w:r>
@@ -3447,7 +3516,7 @@
               <w:rPr>
                 <w:rStyle w:val="VerbatimChar"/>
               </w:rPr>
-              <w:t xml:space="preserve">notifications</w:t>
+              <w:t xml:space="preserve">users</w:t>
             </w:r>
             <w:r>
               <w:t xml:space="preserve">,</w:t>
@@ -3459,7 +3528,25 @@
               <w:rPr>
                 <w:rStyle w:val="VerbatimChar"/>
               </w:rPr>
-              <w:t xml:space="preserve">users</w:t>
+              <w:t xml:space="preserve">appUpdates</w:t>
+            </w:r>
+            <w:r>
+              <w:t xml:space="preserve"> </w:t>
+            </w:r>
+            <w:r>
+              <w:t xml:space="preserve">(reads</w:t>
+            </w:r>
+            <w:r>
+              <w:t xml:space="preserve"> </w:t>
+            </w:r>
+            <w:r>
+              <w:rPr>
+                <w:rStyle w:val="VerbatimChar"/>
+              </w:rPr>
+              <w:t xml:space="preserve">/app/version.json</w:t>
+            </w:r>
+            <w:r>
+              <w:t xml:space="preserve">)</w:t>
             </w:r>
           </w:p>
         </w:tc>
@@ -5143,7 +5230,181 @@
     </w:tbl>
     <w:p>
       <w:pPr>
-        <w:pStyle w:val="BodyText"/>
+        <w:pStyle w:val="BlockText"/>
+      </w:pPr>
+      <w:r>
+        <w:rPr>
+          <w:i/>
+          <w:iCs/>
+        </w:rPr>
+        <w:t xml:space="preserve">Note.</w:t>
+      </w:r>
+      <w:r>
+        <w:t xml:space="preserve"> </w:t>
+      </w:r>
+      <w:r>
+        <w:t xml:space="preserve">The variables of October 21, 2026 are not in</w:t>
+      </w:r>
+      <w:r>
+        <w:t xml:space="preserve"> </w:t>
+      </w:r>
+      <w:r>
+        <w:rPr>
+          <w:rStyle w:val="VerbatimChar"/>
+        </w:rPr>
+        <w:t xml:space="preserve">.env.example</w:t>
+      </w:r>
+      <w:r>
+        <w:t xml:space="preserve"> </w:t>
+      </w:r>
+      <w:r>
+        <w:t xml:space="preserve">or in the compose file because they have defaults:</w:t>
+      </w:r>
+      <w:r>
+        <w:t xml:space="preserve"> </w:t>
+      </w:r>
+      <w:r>
+        <w:rPr>
+          <w:rStyle w:val="VerbatimChar"/>
+        </w:rPr>
+        <w:t xml:space="preserve">SESSION_CHECK_ENABLED</w:t>
+      </w:r>
+      <w:r>
+        <w:t xml:space="preserve">,</w:t>
+      </w:r>
+      <w:r>
+        <w:t xml:space="preserve"> </w:t>
+      </w:r>
+      <w:r>
+        <w:rPr>
+          <w:rStyle w:val="VerbatimChar"/>
+        </w:rPr>
+        <w:t xml:space="preserve">SESSION_CHECK_CACHE_TTL</w:t>
+      </w:r>
+      <w:r>
+        <w:t xml:space="preserve">, and</w:t>
+      </w:r>
+      <w:r>
+        <w:t xml:space="preserve"> </w:t>
+      </w:r>
+      <w:r>
+        <w:rPr>
+          <w:rStyle w:val="VerbatimChar"/>
+        </w:rPr>
+        <w:t xml:space="preserve">SESSION_CHECK_TIMEOUT</w:t>
+      </w:r>
+      <w:r>
+        <w:t xml:space="preserve"> </w:t>
+      </w:r>
+      <w:r>
+        <w:t xml:space="preserve">(gateway session check: on, 30 s, and 3 s);</w:t>
+      </w:r>
+      <w:r>
+        <w:t xml:space="preserve"> </w:t>
+      </w:r>
+      <w:r>
+        <w:rPr>
+          <w:rStyle w:val="VerbatimChar"/>
+        </w:rPr>
+        <w:t xml:space="preserve">BOOKING_EXPIRY_CHECK_ENABLED</w:t>
+      </w:r>
+      <w:r>
+        <w:t xml:space="preserve"> </w:t>
+      </w:r>
+      <w:r>
+        <w:t xml:space="preserve">and</w:t>
+      </w:r>
+      <w:r>
+        <w:t xml:space="preserve"> </w:t>
+      </w:r>
+      <w:r>
+        <w:rPr>
+          <w:rStyle w:val="VerbatimChar"/>
+        </w:rPr>
+        <w:t xml:space="preserve">BOOKING_EXPIRY_CHECK_INTERVAL</w:t>
+      </w:r>
+      <w:r>
+        <w:t xml:space="preserve"> </w:t>
+      </w:r>
+      <w:r>
+        <w:t xml:space="preserve">(cancellation of scheduled bookings that expired without confirmation, in booking-service: on and every 5 minutes);</w:t>
+      </w:r>
+      <w:r>
+        <w:t xml:space="preserve"> </w:t>
+      </w:r>
+      <w:r>
+        <w:rPr>
+          <w:rStyle w:val="VerbatimChar"/>
+        </w:rPr>
+        <w:t xml:space="preserve">BOOKING_EXPIRY_GRACE_MINUTES</w:t>
+      </w:r>
+      <w:r>
+        <w:t xml:space="preserve"> </w:t>
+      </w:r>
+      <w:r>
+        <w:t xml:space="preserve">(60-minute grace after the end of the booking, used by booking-service and operations-service); and</w:t>
+      </w:r>
+      <w:r>
+        <w:t xml:space="preserve"> </w:t>
+      </w:r>
+      <w:r>
+        <w:rPr>
+          <w:rStyle w:val="VerbatimChar"/>
+        </w:rPr>
+        <w:t xml:space="preserve">FOLLOW_UP_ENABLED</w:t>
+      </w:r>
+      <w:r>
+        <w:t xml:space="preserve"> </w:t>
+      </w:r>
+      <w:r>
+        <w:t xml:space="preserve">and</w:t>
+      </w:r>
+      <w:r>
+        <w:t xml:space="preserve"> </w:t>
+      </w:r>
+      <w:r>
+        <w:rPr>
+          <w:rStyle w:val="VerbatimChar"/>
+        </w:rPr>
+        <w:t xml:space="preserve">FOLLOW_UP_INTERVAL</w:t>
+      </w:r>
+      <w:r>
+        <w:t xml:space="preserve"> </w:t>
+      </w:r>
+      <w:r>
+        <w:t xml:space="preserve">(follow-up of the bookings that ended and nobody closed, in operations-service: on and every 5 minutes; it needs</w:t>
+      </w:r>
+      <w:r>
+        <w:t xml:space="preserve"> </w:t>
+      </w:r>
+      <w:r>
+        <w:rPr>
+          <w:rStyle w:val="VerbatimChar"/>
+        </w:rPr>
+        <w:t xml:space="preserve">INTERNAL_API_KEY</w:t>
+      </w:r>
+      <w:r>
+        <w:t xml:space="preserve">). They only change when the service runs from the IDE or when they are added to the service</w:t>
+      </w:r>
+      <w:r>
+        <w:t xml:space="preserve"> </w:t>
+      </w:r>
+      <w:r>
+        <w:rPr>
+          <w:rStyle w:val="VerbatimChar"/>
+        </w:rPr>
+        <w:t xml:space="preserve">environment</w:t>
+      </w:r>
+      <w:r>
+        <w:t xml:space="preserve"> </w:t>
+      </w:r>
+      <w:r>
+        <w:t xml:space="preserve">in the compose file.</w:t>
+      </w:r>
+    </w:p>
+    <w:p>
+      <w:pPr>
+        <w:pStyle w:val="FirstParagraph"/>
       </w:pPr>
       <w:r>
         <w:t xml:space="preserve">To run a Java service from the console, use its Maven Wrapper (</w:t>

</xml_diff>

<commit_message>
docs(artifacts): regenerate the PDF and Word
</commit_message>
<xml_diff>
--- a/05_ARTEFACTOS_DE_CODIGO/EN/WORD/05_Code_Artifacts.docx
+++ b/05_ARTEFACTOS_DE_CODIGO/EN/WORD/05_Code_Artifacts.docx
@@ -268,7 +268,7 @@
               <w:pStyle w:val="Compact"/>
             </w:pPr>
             <w:r>
-              <w:t xml:space="preserve">October 24, 2026</w:t>
+              <w:t xml:space="preserve">October 27, 2026</w:t>
             </w:r>
           </w:p>
         </w:tc>
@@ -430,7 +430,37 @@
         <w:t xml:space="preserve"> </w:t>
       </w:r>
       <w:r>
-        <w:t xml:space="preserve">in the web, the mobile app, payment-service, and infra, and the public server runs</w:t>
+        <w:t xml:space="preserve">in the web, the mobile app, payment-service, and infra, and on October 27</w:t>
+      </w:r>
+      <w:r>
+        <w:t xml:space="preserve"> </w:t>
+      </w:r>
+      <w:r>
+        <w:rPr>
+          <w:rStyle w:val="VerbatimChar"/>
+        </w:rPr>
+        <w:t xml:space="preserve">v1.1.1</w:t>
+      </w:r>
+      <w:r>
+        <w:t xml:space="preserve"> </w:t>
+      </w:r>
+      <w:r>
+        <w:t xml:space="preserve">in customer-service and booking-service and</w:t>
+      </w:r>
+      <w:r>
+        <w:t xml:space="preserve"> </w:t>
+      </w:r>
+      <w:r>
+        <w:rPr>
+          <w:rStyle w:val="VerbatimChar"/>
+        </w:rPr>
+        <w:t xml:space="preserve">v1.1.2</w:t>
+      </w:r>
+      <w:r>
+        <w:t xml:space="preserve"> </w:t>
+      </w:r>
+      <w:r>
+        <w:t xml:space="preserve">in the web, payment-service, infra, and the mobile app (the latter only with a corrected text, which reaches the phones over the internet).</w:t>
       </w:r>
       <w:r>
         <w:t xml:space="preserve"> </w:t>
@@ -442,7 +472,37 @@
         <w:t xml:space="preserve">main</w:t>
       </w:r>
       <w:r>
-        <w:t xml:space="preserve">. The published web image runs nginx without</w:t>
+        <w:t xml:space="preserve"> </w:t>
+      </w:r>
+      <w:r>
+        <w:t xml:space="preserve">has been protected in the 10 repositories since</w:t>
+      </w:r>
+      <w:r>
+        <w:t xml:space="preserve"> </w:t>
+      </w:r>
+      <w:r>
+        <w:rPr>
+          <w:rStyle w:val="VerbatimChar"/>
+        </w:rPr>
+        <w:t xml:space="preserve">v1.0.0</w:t>
+      </w:r>
+      <w:r>
+        <w:t xml:space="preserve"> </w:t>
+      </w:r>
+      <w:r>
+        <w:t xml:space="preserve">(it only takes changes through a pull request with one approval and a green CI) and the public server runs</w:t>
+      </w:r>
+      <w:r>
+        <w:t xml:space="preserve"> </w:t>
+      </w:r>
+      <w:r>
+        <w:rPr>
+          <w:rStyle w:val="VerbatimChar"/>
+        </w:rPr>
+        <w:t xml:space="preserve">main</w:t>
+      </w:r>
+      <w:r>
+        <w:t xml:space="preserve">, which continuous deployment updates on every merge. The published web image runs nginx without</w:t>
       </w:r>
       <w:r>
         <w:t xml:space="preserve"> </w:t>
@@ -1212,7 +1272,85 @@
     </w:tbl>
     <w:p>
       <w:pPr>
-        <w:pStyle w:val="BodyText"/>
+        <w:pStyle w:val="BlockText"/>
+      </w:pPr>
+      <w:r>
+        <w:rPr>
+          <w:i/>
+          <w:iCs/>
+        </w:rPr>
+        <w:t xml:space="preserve">Note.</w:t>
+      </w:r>
+      <w:r>
+        <w:t xml:space="preserve"> </w:t>
+      </w:r>
+      <w:r>
+        <w:t xml:space="preserve">The commits and dates are those of the October 24, 2026 cut-off and were not counted again. The versions in force on</w:t>
+      </w:r>
+      <w:r>
+        <w:t xml:space="preserve"> </w:t>
+      </w:r>
+      <w:r>
+        <w:rPr>
+          <w:rStyle w:val="VerbatimChar"/>
+        </w:rPr>
+        <w:t xml:space="preserve">main</w:t>
+      </w:r>
+      <w:r>
+        <w:t xml:space="preserve"> </w:t>
+      </w:r>
+      <w:r>
+        <w:t xml:space="preserve">are those of October 27, 2026:</w:t>
+      </w:r>
+      <w:r>
+        <w:t xml:space="preserve"> </w:t>
+      </w:r>
+      <w:r>
+        <w:rPr>
+          <w:rStyle w:val="VerbatimChar"/>
+        </w:rPr>
+        <w:t xml:space="preserve">v1.1.0</w:t>
+      </w:r>
+      <w:r>
+        <w:t xml:space="preserve"> </w:t>
+      </w:r>
+      <w:r>
+        <w:t xml:space="preserve">in the API Gateway, security-service, operations-service, and notification-service;</w:t>
+      </w:r>
+      <w:r>
+        <w:t xml:space="preserve"> </w:t>
+      </w:r>
+      <w:r>
+        <w:rPr>
+          <w:rStyle w:val="VerbatimChar"/>
+        </w:rPr>
+        <w:t xml:space="preserve">v1.1.1</w:t>
+      </w:r>
+      <w:r>
+        <w:t xml:space="preserve"> </w:t>
+      </w:r>
+      <w:r>
+        <w:t xml:space="preserve">in customer-service and booking-service; and</w:t>
+      </w:r>
+      <w:r>
+        <w:t xml:space="preserve"> </w:t>
+      </w:r>
+      <w:r>
+        <w:rPr>
+          <w:rStyle w:val="VerbatimChar"/>
+        </w:rPr>
+        <w:t xml:space="preserve">v1.1.2</w:t>
+      </w:r>
+      <w:r>
+        <w:t xml:space="preserve"> </w:t>
+      </w:r>
+      <w:r>
+        <w:t xml:space="preserve">in the web, the mobile app, payment-service, and infra.</w:t>
+      </w:r>
+    </w:p>
+    <w:p>
+      <w:pPr>
+        <w:pStyle w:val="FirstParagraph"/>
       </w:pPr>
       <w:r>
         <w:rPr>
@@ -5366,6 +5504,111 @@
           </w:p>
         </w:tc>
       </w:tr>
+      <w:tr>
+        <w:tc>
+          <w:tcPr/>
+          <w:p>
+            <w:pPr>
+              <w:pStyle w:val="Compact"/>
+            </w:pPr>
+            <w:r>
+              <w:t xml:space="preserve">Payment at booking (booking-service)</w:t>
+            </w:r>
+          </w:p>
+        </w:tc>
+        <w:tc>
+          <w:tcPr/>
+          <w:p>
+            <w:pPr>
+              <w:pStyle w:val="Compact"/>
+            </w:pPr>
+            <w:r>
+              <w:rPr>
+                <w:rStyle w:val="VerbatimChar"/>
+              </w:rPr>
+              <w:t xml:space="preserve">BOOKING_CASH_ACTIVE_LIMIT</w:t>
+            </w:r>
+            <w:r>
+              <w:t xml:space="preserve"> </w:t>
+            </w:r>
+            <w:r>
+              <w:t xml:space="preserve">(active cash bookings per customer, 1),</w:t>
+            </w:r>
+            <w:r>
+              <w:t xml:space="preserve"> </w:t>
+            </w:r>
+            <w:r>
+              <w:rPr>
+                <w:rStyle w:val="VerbatimChar"/>
+              </w:rPr>
+              <w:t xml:space="preserve">BOOKING_PAYMENT_WINDOW</w:t>
+            </w:r>
+            <w:r>
+              <w:t xml:space="preserve"> </w:t>
+            </w:r>
+            <w:r>
+              <w:t xml:space="preserve">(deadline to upload the receipt of a digital booking, 30m),</w:t>
+            </w:r>
+            <w:r>
+              <w:t xml:space="preserve"> </w:t>
+            </w:r>
+            <w:r>
+              <w:rPr>
+                <w:rStyle w:val="VerbatimChar"/>
+              </w:rPr>
+              <w:t xml:space="preserve">BOOKING_PAYMENT_EXPIRY_ENABLED</w:t>
+            </w:r>
+            <w:r>
+              <w:t xml:space="preserve"> </w:t>
+            </w:r>
+            <w:r>
+              <w:t xml:space="preserve">and</w:t>
+            </w:r>
+            <w:r>
+              <w:t xml:space="preserve"> </w:t>
+            </w:r>
+            <w:r>
+              <w:rPr>
+                <w:rStyle w:val="VerbatimChar"/>
+              </w:rPr>
+              <w:t xml:space="preserve">BOOKING_PAYMENT_EXPIRY_INTERVAL</w:t>
+            </w:r>
+            <w:r>
+              <w:t xml:space="preserve"> </w:t>
+            </w:r>
+            <w:r>
+              <w:t xml:space="preserve">(cancellation with</w:t>
+            </w:r>
+            <w:r>
+              <w:t xml:space="preserve"> </w:t>
+            </w:r>
+            <w:r>
+              <w:rPr>
+                <w:rStyle w:val="VerbatimChar"/>
+              </w:rPr>
+              <w:t xml:space="preserve">PAYMENT_TIMEOUT</w:t>
+            </w:r>
+            <w:r>
+              <w:t xml:space="preserve"> </w:t>
+            </w:r>
+            <w:r>
+              <w:t xml:space="preserve">of overdue digital bookings: on and every 60s); commented out in</w:t>
+            </w:r>
+            <w:r>
+              <w:t xml:space="preserve"> </w:t>
+            </w:r>
+            <w:r>
+              <w:rPr>
+                <w:rStyle w:val="VerbatimChar"/>
+              </w:rPr>
+              <w:t xml:space="preserve">.env.example</w:t>
+            </w:r>
+            <w:r>
+              <w:t xml:space="preserve">, with defaults</w:t>
+            </w:r>
+          </w:p>
+        </w:tc>
+      </w:tr>
     </w:tbl>
     <w:p>
       <w:pPr>
@@ -6234,7 +6477,16 @@
         <w:t xml:space="preserve"> </w:t>
       </w:r>
       <w:r>
-        <w:t xml:space="preserve">variables; it has not been run against Azure yet.</w:t>
+        <w:t xml:space="preserve">variables; it has not been run against Azure yet. The local run of the 19 end-to-end tests on October 27, 2026 passed 19 of 19, after the suite was adjusted to send the payment mode (</w:t>
+      </w:r>
+      <w:r>
+        <w:rPr>
+          <w:rStyle w:val="VerbatimChar"/>
+        </w:rPr>
+        <w:t xml:space="preserve">paymentMode</w:t>
+      </w:r>
+      <w:r>
+        <w:t xml:space="preserve">) when booking.</w:t>
       </w:r>
     </w:p>
     <w:bookmarkEnd w:id="30"/>

</xml_diff>